<commit_message>
small changes on index
+ resume update
</commit_message>
<xml_diff>
--- a/Resumes/Salih_Unal_Resume.docx
+++ b/Resumes/Salih_Unal_Resume.docx
@@ -90,26 +90,6 @@
                 <w:bCs/>
                 <w:lang w:val="tr-TR"/>
               </w:rPr>
-              <w:t>Founder</w:t>
-            </w:r>
-            <w:proofErr w:type="spellEnd"/>
-            <w:r>
-              <w:rPr>
-                <w:rFonts w:ascii="Calibri" w:hAnsi="Calibri" w:cs="Calibri"/>
-                <w:b/>
-                <w:bCs/>
-                <w:lang w:val="tr-TR"/>
-              </w:rPr>
-              <w:t xml:space="preserve"> / </w:t>
-            </w:r>
-            <w:proofErr w:type="spellStart"/>
-            <w:r>
-              <w:rPr>
-                <w:rFonts w:ascii="Calibri" w:hAnsi="Calibri" w:cs="Calibri"/>
-                <w:b/>
-                <w:bCs/>
-                <w:lang w:val="tr-TR"/>
-              </w:rPr>
               <w:t>Gameplay</w:t>
             </w:r>
             <w:proofErr w:type="spellEnd"/>
@@ -160,40 +140,6 @@
                 <w:szCs w:val="22"/>
               </w:rPr>
               <w:t>wolderado@gmail.com</w:t>
-            </w:r>
-          </w:p>
-          <w:p>
-            <w:pPr>
-              <w:ind w:left="720" w:hanging="720"/>
-              <w:rPr>
-                <w:rFonts w:ascii="Calibri" w:hAnsi="Calibri" w:cs="Calibri"/>
-                <w:sz w:val="22"/>
-                <w:szCs w:val="22"/>
-              </w:rPr>
-            </w:pPr>
-            <w:r>
-              <w:rPr>
-                <w:rFonts w:ascii="Segoe UI Emoji" w:hAnsi="Segoe UI Emoji" w:cs="Segoe UI Emoji"/>
-                <w:sz w:val="22"/>
-                <w:szCs w:val="22"/>
-              </w:rPr>
-              <w:t>📞</w:t>
-            </w:r>
-            <w:r>
-              <w:rPr>
-                <w:rFonts w:ascii="Calibri" w:hAnsi="Calibri" w:cs="Calibri"/>
-                <w:sz w:val="22"/>
-                <w:szCs w:val="22"/>
-              </w:rPr>
-              <w:t xml:space="preserve"> </w:t>
-            </w:r>
-            <w:r>
-              <w:rPr>
-                <w:rFonts w:ascii="Calibri" w:hAnsi="Calibri" w:cs="Calibri"/>
-                <w:sz w:val="22"/>
-                <w:szCs w:val="22"/>
-              </w:rPr>
-              <w:t>+905435310401</w:t>
             </w:r>
           </w:p>
           <w:p>
@@ -244,6 +190,57 @@
             </w:pPr>
             <w:r>
               <w:rPr>
+                <mc:AlternateContent>
+                  <mc:Choice Requires="w16se">
+                    <w:rFonts w:ascii="Calibri" w:hAnsi="Calibri" w:cs="Calibri"/>
+                  </mc:Choice>
+                  <mc:Fallback>
+                    <w:rFonts w:ascii="Segoe UI Emoji" w:eastAsia="Segoe UI Emoji" w:hAnsi="Segoe UI Emoji" w:cs="Segoe UI Emoji"/>
+                  </mc:Fallback>
+                </mc:AlternateContent>
+                <w:sz w:val="22"/>
+                <w:szCs w:val="22"/>
+              </w:rPr>
+              <mc:AlternateContent>
+                <mc:Choice Requires="w16se">
+                  <w16se:symEx w16se:font="Segoe UI Emoji" w16se:char="1F47E"/>
+                </mc:Choice>
+                <mc:Fallback>
+                  <w:t>👾</w:t>
+                </mc:Fallback>
+              </mc:AlternateContent>
+            </w:r>
+            <w:r>
+              <w:rPr>
+                <w:rFonts w:ascii="Calibri" w:hAnsi="Calibri" w:cs="Calibri"/>
+                <w:sz w:val="22"/>
+                <w:szCs w:val="22"/>
+              </w:rPr>
+              <w:t xml:space="preserve"> </w:t>
+            </w:r>
+            <w:hyperlink r:id="rId8" w:history="1">
+              <w:r>
+                <w:rPr>
+                  <w:rStyle w:val="Hyperlink"/>
+                  <w:rFonts w:ascii="Calibri" w:hAnsi="Calibri" w:cs="Calibri"/>
+                  <w:sz w:val="22"/>
+                  <w:szCs w:val="22"/>
+                </w:rPr>
+                <w:t>Itch.io</w:t>
+              </w:r>
+            </w:hyperlink>
+          </w:p>
+          <w:p>
+            <w:pPr>
+              <w:ind w:left="720" w:hanging="720"/>
+              <w:rPr>
+                <w:rFonts w:ascii="Calibri" w:hAnsi="Calibri" w:cs="Calibri"/>
+                <w:sz w:val="22"/>
+                <w:szCs w:val="22"/>
+              </w:rPr>
+            </w:pPr>
+            <w:r>
+              <w:rPr>
                 <w:rFonts w:ascii="Segoe UI Emoji" w:hAnsi="Segoe UI Emoji" w:cs="Segoe UI Emoji"/>
                 <w:sz w:val="22"/>
                 <w:szCs w:val="22"/>
@@ -258,7 +255,7 @@
               </w:rPr>
               <w:t xml:space="preserve"> </w:t>
             </w:r>
-            <w:hyperlink r:id="rId8" w:history="1">
+            <w:hyperlink r:id="rId9" w:history="1">
               <w:r>
                 <w:rPr>
                   <w:rStyle w:val="Hyperlink"/>
@@ -308,7 +305,7 @@
               </w:rPr>
               <w:t xml:space="preserve"> </w:t>
             </w:r>
-            <w:hyperlink r:id="rId9" w:history="1">
+            <w:hyperlink r:id="rId10" w:history="1">
               <w:r>
                 <w:rPr>
                   <w:rStyle w:val="Hyperlink"/>
@@ -364,24 +361,6 @@
           </w:p>
           <w:p>
             <w:pPr>
-              <w:jc w:val="both"/>
-              <w:rPr>
-                <w:rFonts w:ascii="Calibri" w:hAnsi="Calibri" w:cs="Calibri"/>
-                <w:sz w:val="22"/>
-                <w:szCs w:val="22"/>
-              </w:rPr>
-            </w:pPr>
-            <w:r>
-              <w:rPr>
-                <w:rFonts w:ascii="Calibri" w:hAnsi="Calibri" w:cs="Calibri"/>
-                <w:sz w:val="22"/>
-                <w:szCs w:val="22"/>
-              </w:rPr>
-              <w:t>Core:</w:t>
-            </w:r>
-          </w:p>
-          <w:p>
-            <w:pPr>
               <w:pStyle w:val="ListParagraph"/>
               <w:numPr>
                 <w:ilvl w:val="0"/>
@@ -516,32 +495,6 @@
                 <w:szCs w:val="22"/>
               </w:rPr>
               <w:t>Procedural Generation</w:t>
-            </w:r>
-          </w:p>
-          <w:p>
-            <w:pPr>
-              <w:rPr>
-                <w:rFonts w:ascii="Calibri" w:hAnsi="Calibri" w:cs="Calibri"/>
-                <w:sz w:val="22"/>
-                <w:szCs w:val="22"/>
-              </w:rPr>
-            </w:pPr>
-          </w:p>
-          <w:p>
-            <w:pPr>
-              <w:rPr>
-                <w:rFonts w:ascii="Calibri" w:hAnsi="Calibri" w:cs="Calibri"/>
-                <w:sz w:val="22"/>
-                <w:szCs w:val="22"/>
-              </w:rPr>
-            </w:pPr>
-            <w:r>
-              <w:rPr>
-                <w:rFonts w:ascii="Calibri" w:hAnsi="Calibri" w:cs="Calibri"/>
-                <w:sz w:val="22"/>
-                <w:szCs w:val="22"/>
-              </w:rPr>
-              <w:t>Familiar With:</w:t>
             </w:r>
           </w:p>
           <w:p>
@@ -1196,7 +1149,7 @@
               </w:rPr>
               <w:t xml:space="preserve">Created over </w:t>
             </w:r>
-            <w:hyperlink r:id="rId10" w:history="1">
+            <w:hyperlink r:id="rId11" w:history="1">
               <w:r>
                 <w:rPr>
                   <w:rStyle w:val="Hyperlink"/>
@@ -1206,18 +1159,7 @@
                   <w:sz w:val="22"/>
                   <w:szCs w:val="22"/>
                 </w:rPr>
-                <w:t xml:space="preserve">45+ </w:t>
-              </w:r>
-              <w:r>
-                <w:rPr>
-                  <w:rStyle w:val="Hyperlink"/>
-                  <w:rFonts w:ascii="Calibri" w:hAnsi="Calibri" w:cs="Calibri"/>
-                  <w:b/>
-                  <w:bCs/>
-                  <w:sz w:val="22"/>
-                  <w:szCs w:val="22"/>
-                </w:rPr>
-                <w:t>games</w:t>
+                <w:t>50 games</w:t>
               </w:r>
             </w:hyperlink>
             <w:r>
@@ -1442,43 +1384,15 @@
                 <w:szCs w:val="20"/>
               </w:rPr>
             </w:pPr>
-            <w:proofErr w:type="gramStart"/>
             <w:r>
               <w:rPr>
                 <w:rFonts w:ascii="Calibri" w:hAnsi="Calibri" w:cs="Calibri"/>
                 <w:sz w:val="20"/>
                 <w:szCs w:val="20"/>
               </w:rPr>
-              <w:t>Personally</w:t>
-            </w:r>
-            <w:proofErr w:type="gramEnd"/>
-            <w:r>
-              <w:rPr>
-                <w:rFonts w:ascii="Calibri" w:hAnsi="Calibri" w:cs="Calibri"/>
-                <w:sz w:val="20"/>
-                <w:szCs w:val="20"/>
-              </w:rPr>
-              <w:t xml:space="preserve"> implemented </w:t>
-            </w:r>
-            <w:proofErr w:type="gramStart"/>
-            <w:r>
-              <w:rPr>
-                <w:rFonts w:ascii="Calibri" w:hAnsi="Calibri" w:cs="Calibri"/>
-                <w:sz w:val="20"/>
-                <w:szCs w:val="20"/>
-              </w:rPr>
-              <w:t>the majority of</w:t>
-            </w:r>
-            <w:proofErr w:type="gramEnd"/>
-            <w:r>
-              <w:rPr>
-                <w:rFonts w:ascii="Calibri" w:hAnsi="Calibri" w:cs="Calibri"/>
-                <w:sz w:val="20"/>
-                <w:szCs w:val="20"/>
-              </w:rPr>
-              <w:t xml:space="preserve"> gameplay systems for two commercial Steam releases, including </w:t>
-            </w:r>
-            <w:hyperlink r:id="rId11" w:history="1">
+              <w:t xml:space="preserve">Personally implemented the majority of gameplay systems for two commercial Steam releases, including </w:t>
+            </w:r>
+            <w:hyperlink r:id="rId12" w:history="1">
               <w:r>
                 <w:rPr>
                   <w:rStyle w:val="Hyperlink"/>
@@ -1497,7 +1411,7 @@
               </w:rPr>
               <w:t xml:space="preserve">, published by </w:t>
             </w:r>
-            <w:hyperlink r:id="rId12" w:history="1">
+            <w:hyperlink r:id="rId13" w:history="1">
               <w:proofErr w:type="spellStart"/>
               <w:r>
                 <w:rPr>
@@ -1549,7 +1463,7 @@
               </w:rPr>
               <w:t xml:space="preserve">Developed and released </w:t>
             </w:r>
-            <w:hyperlink r:id="rId13" w:history="1">
+            <w:hyperlink r:id="rId14" w:history="1">
               <w:r>
                 <w:rPr>
                   <w:rStyle w:val="Hyperlink"/>
@@ -1568,7 +1482,7 @@
               </w:rPr>
               <w:t xml:space="preserve"> and </w:t>
             </w:r>
-            <w:hyperlink r:id="rId14" w:history="1">
+            <w:hyperlink r:id="rId15" w:history="1">
               <w:proofErr w:type="spellStart"/>
               <w:r>
                 <w:rPr>
@@ -1945,31 +1859,7 @@
                 <w:sz w:val="20"/>
                 <w:szCs w:val="20"/>
               </w:rPr>
-              <w:t xml:space="preserve"> team of 6 </w:t>
-            </w:r>
-            <w:r>
-              <w:rPr>
-                <w:rFonts w:ascii="Calibri" w:hAnsi="Calibri" w:cs="Calibri"/>
-                <w:sz w:val="20"/>
-                <w:szCs w:val="20"/>
-              </w:rPr>
-              <w:t>while</w:t>
-            </w:r>
-            <w:r>
-              <w:rPr>
-                <w:rFonts w:ascii="Calibri" w:hAnsi="Calibri" w:cs="Calibri"/>
-                <w:sz w:val="20"/>
-                <w:szCs w:val="20"/>
-              </w:rPr>
-              <w:t xml:space="preserve"> bringing the vision of the director to life</w:t>
-            </w:r>
-            <w:r>
-              <w:rPr>
-                <w:rFonts w:ascii="Calibri" w:hAnsi="Calibri" w:cs="Calibri"/>
-                <w:sz w:val="20"/>
-                <w:szCs w:val="20"/>
-              </w:rPr>
-              <w:t>.</w:t>
+              <w:t xml:space="preserve"> team of 6 and bringing the vision of the film director to life</w:t>
             </w:r>
           </w:p>
           <w:p>

</xml_diff>